<commit_message>
docs(innovacion): Cap 2 completo (12-18 cuartillas) + resumen v2 + 9 UMLs
- v2.docx: resumen 'Síntesis de la selección' arriba de la tabla de refs
  justifica cada referencia como componente del pipeline QuinielaTech.
- v3.docx (nuevo): Cap 1 (QuinielaTech) + Cap 2 (Marco Teórico,
  Diseño, Modelado UML completo, Costos, Conclusiones).
- diagramas/: 9 PNG regenerados + 2 .dot (uml_clases, uml_casos_uso).
- Cap 2 cubre 2.2-2.11 con 4 tablas (lenguajes, costos, proyección
  3 años) y 9 figuras UML embebidas con interpretación.
</commit_message>
<xml_diff>
--- a/docs/pendientes/proyecto_de_innovacion_digital_2.docx
+++ b/docs/pendientes/proyecto_de_innovacion_digital_2.docx
@@ -2508,6 +2508,21 @@
           <w:rtl w:val="0"/>
         </w:rPr>
         <w:t xml:space="preserve">Estado del arte</w:t>
+      </w:r>
+    </w:p>
+    <w:p>
+      <w:pPr>
+        <w:spacing w:before="120" w:after="120"/>
+        <w:jc w:val="both"/>
+      </w:pPr>
+      <w:r>
+        <w:rPr>
+          <w:b/>
+        </w:rPr>
+        <w:t xml:space="preserve">Síntesis de la selección. </w:t>
+      </w:r>
+      <w:r>
+        <w:t xml:space="preserve">La tabla condensa la decisión arquitectónica del proyecto: el estado del arte en predicción de fútbol ya no premia un modelo único sino la combinación calibrada de técnicas heterogéneas (estadística clásica + aprendizaje profundo + valoración táctica + modelos de lenguaje). Cada referencia se seleccionó porque cubre un componente concreto del pipeline real de QuinielaTech/Predictions_MX: Dixon-Coles (ref. 6) sustenta el modelo base del ensemble, pi-football (ref. 7) valida la calibración Platt 1-vs-rest, las técnicas xG/xT (refs. 4-5 y 8) alimentan el bloque de features, la survey LLM/multimodal (ref. 9) respalda la capa de debate multi-agente y la arquitectura RNN (ref. 10) informa el consumo de series temporales de partidos. TacticAI y SoccerMap (refs. 1-2) se incluyen únicamente como marco contextual del ecosistema IA-fútbol (Liverpool FC, FC Barcelona), por lo que no alimentan directamente el modelo productivo, pero sirven para situar el proyecto dentro del estado del arte reciente.</w:t>
       </w:r>
     </w:p>
     <w:tbl>

</xml_diff>